<commit_message>
se saca una plantilla de entidad
</commit_message>
<xml_diff>
--- a/public/convenios/ENT-01.docx
+++ b/public/convenios/ENT-01.docx
@@ -1482,7 +1482,49 @@
           <w:rFonts w:asciiTheme="minorHAnsi" w:hAnsiTheme="minorHAnsi" w:cstheme="minorBidi"/>
           <w:sz w:val="22"/>
         </w:rPr>
-        <w:t>El presente Acuerdo entrará en vigor el día de su firma y tendrá una duración de un (1) año, renovable de forma automática por periodos de igual duración. Asimismo, el presente convenio podrá extinguirse por incumplimiento de su propósito por algunas de las entidades, o por deseo expreso de alguna de las mismas, comunicado por escrito a la otra parte con al menos un mes de antelación a la fecha prevista de terminación.</w:t>
+        <w:t xml:space="preserve">El presente Acuerdo entrará en vigor el día de su firma y tendrá una duración de un (1) año, renovable de forma automática por periodos de igual duración. </w:t>
+      </w:r>
+    </w:p>
+    <w:p>
+      <w:pPr>
+        <w:tabs>
+          <w:tab w:val="center" w:pos="3541"/>
+          <w:tab w:val="center" w:pos="4249"/>
+        </w:tabs>
+        <w:spacing w:after="120"/>
+        <w:ind w:left="-15" w:firstLine="0"/>
+        <w:rPr>
+          <w:rFonts w:asciiTheme="minorHAnsi" w:hAnsiTheme="minorHAnsi" w:cstheme="minorBidi"/>
+          <w:sz w:val="22"/>
+        </w:rPr>
+      </w:pPr>
+      <w:r>
+        <w:rPr>
+          <w:rFonts w:asciiTheme="minorHAnsi" w:hAnsiTheme="minorHAnsi" w:cstheme="minorBidi"/>
+          <w:sz w:val="22"/>
+        </w:rPr>
+        <w:t>La firma del presente convenio de colaboración deja sin efecto cualquier otro acuerdo firmado anteriormente entre las partes, así como los derechos y obligaciones derivados de los mismos.</w:t>
+      </w:r>
+    </w:p>
+    <w:p>
+      <w:pPr>
+        <w:tabs>
+          <w:tab w:val="center" w:pos="3541"/>
+          <w:tab w:val="center" w:pos="4249"/>
+        </w:tabs>
+        <w:spacing w:after="120"/>
+        <w:ind w:left="-15" w:firstLine="0"/>
+        <w:rPr>
+          <w:rFonts w:asciiTheme="minorHAnsi" w:hAnsiTheme="minorHAnsi" w:cstheme="minorBidi"/>
+          <w:sz w:val="22"/>
+        </w:rPr>
+      </w:pPr>
+      <w:r>
+        <w:rPr>
+          <w:rFonts w:asciiTheme="minorHAnsi" w:hAnsiTheme="minorHAnsi" w:cstheme="minorBidi"/>
+          <w:sz w:val="22"/>
+        </w:rPr>
+        <w:t>Asimismo, el presente convenio podrá extinguirse por incumplimiento de su propósito por algunas de las entidades, o por deseo expreso de alguna de las mismas, comunicado por escrito a la otra parte con al menos un mes de antelación a la fecha prevista de terminación.</w:t>
       </w:r>
     </w:p>
     <w:p>
@@ -1614,6 +1656,7 @@
     </w:p>
     <w:p>
       <w:pPr>
+        <w:ind w:left="0" w:firstLine="0"/>
         <w:rPr>
           <w:rFonts w:asciiTheme="minorHAnsi" w:hAnsiTheme="minorHAnsi" w:cstheme="minorHAnsi"/>
           <w:bCs/>
@@ -2678,7 +2721,6 @@
   <w:style w:type="character" w:default="1" w:styleId="Fuentedeprrafopredeter">
     <w:name w:val="Default Paragraph Font"/>
     <w:uiPriority w:val="1"/>
-    <w:semiHidden/>
     <w:unhideWhenUsed/>
   </w:style>
   <w:style w:type="table" w:default="1" w:styleId="Tablanormal">
@@ -3122,26 +3164,6 @@
 </file>
 
 <file path=customXml/item1.xml><?xml version="1.0" encoding="utf-8"?>
-<p:properties xmlns:p="http://schemas.microsoft.com/office/2006/metadata/properties" xmlns:xsi="http://www.w3.org/2001/XMLSchema-instance" xmlns:pc="http://schemas.microsoft.com/office/infopath/2007/PartnerControls">
-  <documentManagement>
-    <TaxCatchAll xmlns="cb90855b-590b-4046-bde3-5b9a5aa76822" xsi:nil="true"/>
-    <lcf76f155ced4ddcb4097134ff3c332f xmlns="2cad0c96-b44f-494c-bd1a-65b9e73a9232">
-      <Terms xmlns="http://schemas.microsoft.com/office/infopath/2007/PartnerControls"/>
-    </lcf76f155ced4ddcb4097134ff3c332f>
-  </documentManagement>
-</p:properties>
-</file>
-
-<file path=customXml/item2.xml><?xml version="1.0" encoding="utf-8"?>
-<?mso-contentType ?>
-<FormTemplates xmlns="http://schemas.microsoft.com/sharepoint/v3/contenttype/forms">
-  <Display>DocumentLibraryForm</Display>
-  <Edit>DocumentLibraryForm</Edit>
-  <New>DocumentLibraryForm</New>
-</FormTemplates>
-</file>
-
-<file path=customXml/item3.xml><?xml version="1.0" encoding="utf-8"?>
 <ct:contentTypeSchema xmlns:ct="http://schemas.microsoft.com/office/2006/metadata/contentType" xmlns:ma="http://schemas.microsoft.com/office/2006/metadata/properties/metaAttributes" ct:_="" ma:_="" ma:contentTypeName="Documento" ma:contentTypeID="0x010100460DEE0F2C44F94598A5259A77A6205B" ma:contentTypeVersion="19" ma:contentTypeDescription="Crear nuevo documento." ma:contentTypeScope="" ma:versionID="12159bb467302f72b7035e44db06965e">
   <xsd:schema xmlns:xsd="http://www.w3.org/2001/XMLSchema" xmlns:xs="http://www.w3.org/2001/XMLSchema" xmlns:p="http://schemas.microsoft.com/office/2006/metadata/properties" xmlns:ns2="2cad0c96-b44f-494c-bd1a-65b9e73a9232" xmlns:ns3="cb90855b-590b-4046-bde3-5b9a5aa76822" targetNamespace="http://schemas.microsoft.com/office/2006/metadata/properties" ma:root="true" ma:fieldsID="e266071875ede18c6d4a0178199cd205" ns2:_="" ns3:_="">
     <xsd:import namespace="2cad0c96-b44f-494c-bd1a-65b9e73a9232"/>
@@ -3402,27 +3424,28 @@
 </ct:contentTypeSchema>
 </file>
 
-<file path=customXml/itemProps1.xml><?xml version="1.0" encoding="utf-8"?>
-<ds:datastoreItem xmlns:ds="http://schemas.openxmlformats.org/officeDocument/2006/customXml" ds:itemID="{F57E8FF3-E0CA-4E10-B402-C76BF94A1EDA}">
-  <ds:schemaRefs>
-    <ds:schemaRef ds:uri="http://schemas.microsoft.com/office/2006/metadata/properties"/>
-    <ds:schemaRef ds:uri="http://schemas.microsoft.com/office/infopath/2007/PartnerControls"/>
-    <ds:schemaRef ds:uri="cb90855b-590b-4046-bde3-5b9a5aa76822"/>
-    <ds:schemaRef ds:uri="2cad0c96-b44f-494c-bd1a-65b9e73a9232"/>
-  </ds:schemaRefs>
-</ds:datastoreItem>
+<file path=customXml/item2.xml><?xml version="1.0" encoding="utf-8"?>
+<?mso-contentType ?>
+<FormTemplates xmlns="http://schemas.microsoft.com/sharepoint/v3/contenttype/forms">
+  <Display>DocumentLibraryForm</Display>
+  <Edit>DocumentLibraryForm</Edit>
+  <New>DocumentLibraryForm</New>
+</FormTemplates>
 </file>
 
-<file path=customXml/itemProps2.xml><?xml version="1.0" encoding="utf-8"?>
-<ds:datastoreItem xmlns:ds="http://schemas.openxmlformats.org/officeDocument/2006/customXml" ds:itemID="{7303E953-E6BE-4319-9723-1BB242113BE4}">
-  <ds:schemaRefs>
-    <ds:schemaRef ds:uri="http://schemas.microsoft.com/sharepoint/v3/contenttype/forms"/>
-  </ds:schemaRefs>
-</ds:datastoreItem>
+<file path=customXml/item3.xml><?xml version="1.0" encoding="utf-8"?>
+<p:properties xmlns:p="http://schemas.microsoft.com/office/2006/metadata/properties" xmlns:xsi="http://www.w3.org/2001/XMLSchema-instance" xmlns:pc="http://schemas.microsoft.com/office/infopath/2007/PartnerControls">
+  <documentManagement>
+    <TaxCatchAll xmlns="cb90855b-590b-4046-bde3-5b9a5aa76822" xsi:nil="true"/>
+    <lcf76f155ced4ddcb4097134ff3c332f xmlns="2cad0c96-b44f-494c-bd1a-65b9e73a9232">
+      <Terms xmlns="http://schemas.microsoft.com/office/infopath/2007/PartnerControls"/>
+    </lcf76f155ced4ddcb4097134ff3c332f>
+  </documentManagement>
+</p:properties>
 </file>
 
-<file path=customXml/itemProps3.xml><?xml version="1.0" encoding="utf-8"?>
-<ds:datastoreItem xmlns:ds="http://schemas.openxmlformats.org/officeDocument/2006/customXml" ds:itemID="{C0412C41-AC60-4DBE-BA05-D03211E6BAEF}">
+<file path=customXml/itemProps1.xml><?xml version="1.0" encoding="utf-8"?>
+<ds:datastoreItem xmlns:ds="http://schemas.openxmlformats.org/officeDocument/2006/customXml" ds:itemID="{B39E822E-58AC-431E-B25A-8858987647E4}">
   <ds:schemaRefs>
     <ds:schemaRef ds:uri="http://schemas.microsoft.com/office/2006/metadata/contentType"/>
     <ds:schemaRef ds:uri="http://schemas.microsoft.com/office/2006/metadata/properties/metaAttributes"/>
@@ -3438,4 +3461,23 @@
     <ds:schemaRef ds:uri="http://schemas.microsoft.com/internal/obd"/>
   </ds:schemaRefs>
 </ds:datastoreItem>
+</file>
+
+<file path=customXml/itemProps2.xml><?xml version="1.0" encoding="utf-8"?>
+<ds:datastoreItem xmlns:ds="http://schemas.openxmlformats.org/officeDocument/2006/customXml" ds:itemID="{7303E953-E6BE-4319-9723-1BB242113BE4}">
+  <ds:schemaRefs>
+    <ds:schemaRef ds:uri="http://schemas.microsoft.com/sharepoint/v3/contenttype/forms"/>
+  </ds:schemaRefs>
+</ds:datastoreItem>
+</file>
+
+<file path=customXml/itemProps3.xml><?xml version="1.0" encoding="utf-8"?>
+<ds:datastoreItem xmlns:ds="http://schemas.openxmlformats.org/officeDocument/2006/customXml" ds:itemID="{F57E8FF3-E0CA-4E10-B402-C76BF94A1EDA}">
+  <ds:schemaRefs>
+    <ds:schemaRef ds:uri="http://schemas.microsoft.com/office/2006/metadata/properties"/>
+    <ds:schemaRef ds:uri="http://schemas.microsoft.com/office/infopath/2007/PartnerControls"/>
+    <ds:schemaRef ds:uri="cb90855b-590b-4046-bde3-5b9a5aa76822"/>
+    <ds:schemaRef ds:uri="2cad0c96-b44f-494c-bd1a-65b9e73a9232"/>
+  </ds:schemaRefs>
+</ds:datastoreItem>
 </file>
</xml_diff>